<commit_message>
Added AWS SAA-C03 certification.
</commit_message>
<xml_diff>
--- a/assets/docs/Detailed_Resume.docx
+++ b/assets/docs/Detailed_Resume.docx
@@ -13,24 +13,22 @@
       <w:r>
         <w:rPr>
           <w:noProof/>
-          <w:color w:val="0000FF"/>
-          <w:u w:val="single"/>
         </w:rPr>
         <mc:AlternateContent>
           <mc:Choice Requires="wpg">
             <w:drawing>
-              <wp:anchor distT="0" distB="0" distL="114300" distR="114300" simplePos="0" relativeHeight="251667456" behindDoc="0" locked="0" layoutInCell="1" allowOverlap="1" wp14:anchorId="6B3DE839" wp14:editId="50EAF174">
+              <wp:anchor distT="0" distB="0" distL="114300" distR="114300" simplePos="0" relativeHeight="251659264" behindDoc="0" locked="0" layoutInCell="1" allowOverlap="1" wp14:anchorId="04D49E35" wp14:editId="683B7025">
                 <wp:simplePos x="0" y="0"/>
                 <wp:positionH relativeFrom="column">
-                  <wp:posOffset>2903517</wp:posOffset>
+                  <wp:posOffset>2672152</wp:posOffset>
                 </wp:positionH>
                 <wp:positionV relativeFrom="paragraph">
-                  <wp:posOffset>5938</wp:posOffset>
+                  <wp:posOffset>-19050</wp:posOffset>
                 </wp:positionV>
-                <wp:extent cx="3728613" cy="908685"/>
-                <wp:effectExtent l="0" t="0" r="5715" b="5715"/>
+                <wp:extent cx="3960000" cy="906780"/>
+                <wp:effectExtent l="0" t="0" r="2540" b="7620"/>
                 <wp:wrapNone/>
-                <wp:docPr id="1254869800" name="Group 2"/>
+                <wp:docPr id="505062072" name="Group 4"/>
                 <wp:cNvGraphicFramePr/>
                 <a:graphic xmlns:a="http://schemas.openxmlformats.org/drawingml/2006/main">
                   <a:graphicData uri="http://schemas.microsoft.com/office/word/2010/wordprocessingGroup">
@@ -39,19 +37,19 @@
                       <wpg:grpSpPr>
                         <a:xfrm>
                           <a:off x="0" y="0"/>
-                          <a:ext cx="3728613" cy="908685"/>
+                          <a:ext cx="3960000" cy="906780"/>
                           <a:chOff x="0" y="0"/>
-                          <a:chExt cx="3728613" cy="908685"/>
+                          <a:chExt cx="3604148" cy="906780"/>
                         </a:xfrm>
                       </wpg:grpSpPr>
                       <pic:pic xmlns:pic="http://schemas.openxmlformats.org/drawingml/2006/picture">
                         <pic:nvPicPr>
-                          <pic:cNvPr id="6947183" name="Picture 2"/>
+                          <pic:cNvPr id="1690121867" name="Picture 2"/>
                           <pic:cNvPicPr>
                             <a:picLocks/>
                           </pic:cNvPicPr>
                         </pic:nvPicPr>
-                        <pic:blipFill>
+                        <pic:blipFill rotWithShape="1">
                           <a:blip r:embed="rId8">
                             <a:extLst>
                               <a:ext uri="{28A0092B-C50C-407E-A947-70E740481C1C}">
@@ -59,15 +57,13 @@
                               </a:ext>
                             </a:extLst>
                           </a:blip>
-                          <a:srcRect/>
-                          <a:stretch>
-                            <a:fillRect/>
-                          </a:stretch>
+                          <a:srcRect l="14576" r="15293"/>
+                          <a:stretch/>
                         </pic:blipFill>
                         <pic:spPr bwMode="auto">
                           <a:xfrm>
-                            <a:off x="1531917" y="0"/>
-                            <a:ext cx="982980" cy="908685"/>
+                            <a:off x="2006126" y="0"/>
+                            <a:ext cx="503555" cy="906780"/>
                           </a:xfrm>
                           <a:prstGeom prst="rect">
                             <a:avLst/>
@@ -75,11 +71,19 @@
                           <a:solidFill>
                             <a:schemeClr val="bg1"/>
                           </a:solidFill>
+                          <a:ln>
+                            <a:noFill/>
+                          </a:ln>
+                          <a:extLst>
+                            <a:ext uri="{53640926-AAD7-44D8-BBD7-CCE9431645EC}">
+                              <a14:shadowObscured xmlns:a14="http://schemas.microsoft.com/office/drawing/2010/main"/>
+                            </a:ext>
+                          </a:extLst>
                         </pic:spPr>
                       </pic:pic>
                       <pic:pic xmlns:pic="http://schemas.openxmlformats.org/drawingml/2006/picture">
                         <pic:nvPicPr>
-                          <pic:cNvPr id="432370274" name="Picture 3"/>
+                          <pic:cNvPr id="2010243362" name="Picture 3"/>
                           <pic:cNvPicPr>
                             <a:picLocks/>
                           </pic:cNvPicPr>
@@ -99,8 +103,8 @@
                         </pic:blipFill>
                         <pic:spPr bwMode="auto">
                           <a:xfrm>
-                            <a:off x="2418608" y="0"/>
-                            <a:ext cx="1310005" cy="908685"/>
+                            <a:off x="2525283" y="0"/>
+                            <a:ext cx="1078865" cy="906780"/>
                           </a:xfrm>
                           <a:prstGeom prst="rect">
                             <a:avLst/>
@@ -110,44 +114,13 @@
                       </pic:pic>
                       <pic:pic xmlns:pic="http://schemas.openxmlformats.org/drawingml/2006/picture">
                         <pic:nvPicPr>
-                          <pic:cNvPr id="1800829746" name="Picture 4" descr="SPS (small)"/>
+                          <pic:cNvPr id="626785835" name="Picture 5" descr="pmi-acp"/>
                           <pic:cNvPicPr>
                             <a:picLocks/>
                           </pic:cNvPicPr>
                         </pic:nvPicPr>
                         <pic:blipFill>
                           <a:blip r:embed="rId10">
-                            <a:extLst>
-                              <a:ext uri="{28A0092B-C50C-407E-A947-70E740481C1C}">
-                                <a14:useLocalDpi xmlns:a14="http://schemas.microsoft.com/office/drawing/2010/main" val="0"/>
-                              </a:ext>
-                            </a:extLst>
-                          </a:blip>
-                          <a:srcRect r="2307"/>
-                          <a:stretch>
-                            <a:fillRect/>
-                          </a:stretch>
-                        </pic:blipFill>
-                        <pic:spPr bwMode="auto">
-                          <a:xfrm>
-                            <a:off x="815439" y="0"/>
-                            <a:ext cx="873760" cy="908685"/>
-                          </a:xfrm>
-                          <a:prstGeom prst="rect">
-                            <a:avLst/>
-                          </a:prstGeom>
-                          <a:noFill/>
-                        </pic:spPr>
-                      </pic:pic>
-                      <pic:pic xmlns:pic="http://schemas.openxmlformats.org/drawingml/2006/picture">
-                        <pic:nvPicPr>
-                          <pic:cNvPr id="509764394" name="Picture 5" descr="pmi-acp"/>
-                          <pic:cNvPicPr>
-                            <a:picLocks/>
-                          </pic:cNvPicPr>
-                        </pic:nvPicPr>
-                        <pic:blipFill>
-                          <a:blip r:embed="rId11">
                             <a:extLst>
                               <a:ext uri="{28A0092B-C50C-407E-A947-70E740481C1C}">
                                 <a14:useLocalDpi xmlns:a14="http://schemas.microsoft.com/office/drawing/2010/main" val="0"/>
@@ -161,8 +134,8 @@
                         </pic:blipFill>
                         <pic:spPr bwMode="auto">
                           <a:xfrm>
-                            <a:off x="0" y="0"/>
-                            <a:ext cx="825500" cy="908685"/>
+                            <a:off x="640935" y="0"/>
+                            <a:ext cx="718820" cy="906780"/>
                           </a:xfrm>
                           <a:prstGeom prst="rect">
                             <a:avLst/>
@@ -170,15 +143,93 @@
                           <a:noFill/>
                         </pic:spPr>
                       </pic:pic>
+                      <pic:pic xmlns:pic="http://schemas.openxmlformats.org/drawingml/2006/picture">
+                        <pic:nvPicPr>
+                          <pic:cNvPr id="896425236" name="Picture 1" descr="A blue hexagon with white text&#10;&#10;Description automatically generated"/>
+                          <pic:cNvPicPr>
+                            <a:picLocks/>
+                          </pic:cNvPicPr>
+                        </pic:nvPicPr>
+                        <pic:blipFill rotWithShape="1">
+                          <a:blip r:embed="rId11">
+                            <a:extLst>
+                              <a:ext uri="{28A0092B-C50C-407E-A947-70E740481C1C}">
+                                <a14:useLocalDpi xmlns:a14="http://schemas.microsoft.com/office/drawing/2010/main" val="0"/>
+                              </a:ext>
+                            </a:extLst>
+                          </a:blip>
+                          <a:srcRect l="7734" r="7268"/>
+                          <a:stretch/>
+                        </pic:blipFill>
+                        <pic:spPr bwMode="auto">
+                          <a:xfrm>
+                            <a:off x="0" y="0"/>
+                            <a:ext cx="610235" cy="906145"/>
+                          </a:xfrm>
+                          <a:prstGeom prst="rect">
+                            <a:avLst/>
+                          </a:prstGeom>
+                          <a:noFill/>
+                          <a:ln>
+                            <a:noFill/>
+                          </a:ln>
+                          <a:extLst>
+                            <a:ext uri="{53640926-AAD7-44D8-BBD7-CCE9431645EC}">
+                              <a14:shadowObscured xmlns:a14="http://schemas.microsoft.com/office/drawing/2010/main"/>
+                            </a:ext>
+                          </a:extLst>
+                        </pic:spPr>
+                      </pic:pic>
+                      <pic:pic xmlns:pic="http://schemas.openxmlformats.org/drawingml/2006/picture">
+                        <pic:nvPicPr>
+                          <pic:cNvPr id="2073847686" name="Picture 4" descr="SPS (small)"/>
+                          <pic:cNvPicPr>
+                            <a:picLocks/>
+                          </pic:cNvPicPr>
+                        </pic:nvPicPr>
+                        <pic:blipFill rotWithShape="1">
+                          <a:blip r:embed="rId12">
+                            <a:alphaModFix/>
+                            <a:extLst>
+                              <a:ext uri="{28A0092B-C50C-407E-A947-70E740481C1C}">
+                                <a14:useLocalDpi xmlns:a14="http://schemas.microsoft.com/office/drawing/2010/main" val="0"/>
+                              </a:ext>
+                            </a:extLst>
+                          </a:blip>
+                          <a:srcRect l="5071" t="3540" r="5342" b="4259"/>
+                          <a:stretch/>
+                        </pic:blipFill>
+                        <pic:spPr bwMode="auto">
+                          <a:xfrm>
+                            <a:off x="1360918" y="0"/>
+                            <a:ext cx="658495" cy="906780"/>
+                          </a:xfrm>
+                          <a:prstGeom prst="rect">
+                            <a:avLst/>
+                          </a:prstGeom>
+                          <a:noFill/>
+                          <a:ln>
+                            <a:noFill/>
+                          </a:ln>
+                          <a:extLst>
+                            <a:ext uri="{53640926-AAD7-44D8-BBD7-CCE9431645EC}">
+                              <a14:shadowObscured xmlns:a14="http://schemas.microsoft.com/office/drawing/2010/main"/>
+                            </a:ext>
+                          </a:extLst>
+                        </pic:spPr>
+                      </pic:pic>
                     </wpg:wgp>
                   </a:graphicData>
                 </a:graphic>
+                <wp14:sizeRelH relativeFrom="margin">
+                  <wp14:pctWidth>0</wp14:pctWidth>
+                </wp14:sizeRelH>
               </wp:anchor>
             </w:drawing>
           </mc:Choice>
           <mc:Fallback>
             <w:pict>
-              <v:group w14:anchorId="77C9BE89" id="Group 2" o:spid="_x0000_s1026" style="position:absolute;margin-left:228.6pt;margin-top:.45pt;width:293.6pt;height:71.55pt;z-index:251667456" coordsize="37286,9086" o:gfxdata="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">
+              <v:group w14:anchorId="782C4AB5" id="Group 4" o:spid="_x0000_s1026" style="position:absolute;margin-left:210.4pt;margin-top:-1.5pt;width:311.8pt;height:71.4pt;z-index:251659264;mso-width-relative:margin" coordsize="36041,9067" o:gfxdata="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&